<commit_message>
Add the course repository link to the six-page report
</commit_message>
<xml_diff>
--- a/output/report/训练视角数量与3DGS新视角合成_课程报告.docx
+++ b/output/report/训练视角数量与3DGS新视角合成_课程报告.docx
@@ -40,6 +40,32 @@
       <w:r>
         <w:t>学号：________________　姓名：________________</w:t>
       </w:r>
+    </w:p>
+    <w:p>
+      <w:pPr>
+        <w:keepNext w:val="0"/>
+        <w:spacing w:after="140"/>
+        <w:ind w:firstLine="0"/>
+        <w:jc w:val="center"/>
+      </w:pPr>
+      <w:r>
+        <w:rPr>
+          <w:rFonts w:ascii="Times New Roman" w:hAnsi="Times New Roman" w:cs="Times New Roman" w:eastAsia="宋体"/>
+          <w:b w:val="0"/>
+          <w:color w:val="000000"/>
+          <w:sz w:val="19"/>
+        </w:rPr>
+        <w:t>代码与实验记录：</w:t>
+      </w:r>
+      <w:hyperlink r:id="rId10">
+        <w:r>
+          <w:rPr>
+            <w:sz w:val="19"/>
+            <w:rFonts w:ascii="Times New Roman" w:hAnsi="Times New Roman"/>
+          </w:rPr>
+          <w:t>https://github.com/wwwwwwcy/3dgs-view-count-study</w:t>
+        </w:r>
+      </w:hyperlink>
     </w:p>
     <w:p>
       <w:pPr>
@@ -216,7 +242,7 @@
                     <pic:cNvPicPr/>
                   </pic:nvPicPr>
                   <pic:blipFill>
-                    <a:blip r:embed="rId10"/>
+                    <a:blip r:embed="rId11"/>
                     <a:stretch>
                       <a:fillRect/>
                     </a:stretch>
@@ -1465,7 +1491,7 @@
                     <pic:cNvPicPr/>
                   </pic:nvPicPr>
                   <pic:blipFill>
-                    <a:blip r:embed="rId11"/>
+                    <a:blip r:embed="rId12"/>
                     <a:stretch>
                       <a:fillRect/>
                     </a:stretch>
@@ -2074,7 +2100,7 @@
                     <pic:cNvPicPr/>
                   </pic:nvPicPr>
                   <pic:blipFill>
-                    <a:blip r:embed="rId12"/>
+                    <a:blip r:embed="rId13"/>
                     <a:stretch>
                       <a:fillRect/>
                     </a:stretch>
@@ -2124,7 +2150,7 @@
                     <pic:cNvPicPr/>
                   </pic:nvPicPr>
                   <pic:blipFill>
-                    <a:blip r:embed="rId13"/>
+                    <a:blip r:embed="rId14"/>
                     <a:stretch>
                       <a:fillRect/>
                     </a:stretch>
@@ -2250,7 +2276,7 @@
           <w:color w:val="000000"/>
           <w:sz w:val="21"/>
         </w:rPr>
-        <w:t>场景数据来自 NeRF 作者公开数据；训练方法基于 Nerfstudio Splatfacto 和 gsplat 开源实现，按上游许可证使用并记录版本，不将其称为自行提出的算法。项目新增数据划分、共同初始化、实验调度、指标汇总及绘图脚本。使用 OpenAI Codex 协助环境排错、脚本编写、结果整理与文字编辑；文中指标及图像均来自本机实际运行。代码和实验记录已保存在本地项目，尚未上传 GitHub。</w:t>
+        <w:t>场景数据来自 NeRF 作者公开数据；训练方法基于 Nerfstudio Splatfacto 和 gsplat 开源实现，按上游许可证使用并记录版本，不将其称为自行提出的算法。项目新增数据划分、共同初始化、实验调度、指标汇总及绘图脚本。使用 OpenAI Codex 协助环境排错、脚本编写、结果整理与文字编辑；文中指标及图像均来自本机实际运行。项目代码与实验记录整理为配套仓库，地址见首页。</w:t>
       </w:r>
     </w:p>
     <w:p>

</xml_diff>